<commit_message>
Correccion de la etiqueta {{VALOR_IVA}} en plantilla de Word
</commit_message>
<xml_diff>
--- a/plantillas/INVERSION_5_COMPLEMENTO_CONTRATO_IVA.docx
+++ b/plantillas/INVERSION_5_COMPLEMENTO_CONTRATO_IVA.docx
@@ -348,122 +348,130 @@
           <w:sz w:val="24"/>
           <w:szCs w:val="24"/>
         </w:rPr>
-        <w:t>{VALOR_IVA}}</w:t>
-      </w:r>
-      <w:r>
-        <w:rPr>
-          <w:rFonts w:ascii="Arial" w:eastAsia="Arial" w:hAnsi="Arial" w:cs="Arial"/>
-          <w:sz w:val="24"/>
-          <w:szCs w:val="24"/>
-          <w:highlight w:val="yellow"/>
-        </w:rPr>
-        <w:t xml:space="preserve">). El Distrito de Santiago de Cali pagará el valor del contrato en </w:t>
-      </w:r>
-      <w:r>
-        <w:rPr>
-          <w:rFonts w:ascii="Arial" w:eastAsia="Arial" w:hAnsi="Arial" w:cs="Arial"/>
-          <w:sz w:val="24"/>
-          <w:szCs w:val="24"/>
-        </w:rPr>
-        <w:t>{{NUM_CUOTAS_LETRAS}}</w:t>
-      </w:r>
-      <w:r>
-        <w:rPr>
-          <w:rFonts w:ascii="Arial" w:eastAsia="Arial" w:hAnsi="Arial" w:cs="Arial"/>
-          <w:sz w:val="24"/>
-          <w:szCs w:val="24"/>
-          <w:highlight w:val="yellow"/>
-        </w:rPr>
-        <w:t xml:space="preserve"> (</w:t>
-      </w:r>
-      <w:r>
-        <w:rPr>
-          <w:rFonts w:ascii="Arial" w:eastAsia="Arial" w:hAnsi="Arial" w:cs="Arial"/>
-          <w:sz w:val="24"/>
-          <w:szCs w:val="24"/>
-        </w:rPr>
-        <w:t>{{NUM_CUOTAS_NUMERO}}</w:t>
-      </w:r>
-      <w:r>
-        <w:rPr>
-          <w:rFonts w:ascii="Arial" w:eastAsia="Arial" w:hAnsi="Arial" w:cs="Arial"/>
-          <w:sz w:val="24"/>
-          <w:szCs w:val="24"/>
-          <w:highlight w:val="yellow"/>
-        </w:rPr>
-        <w:t xml:space="preserve">) Cuotas de </w:t>
-      </w:r>
-      <w:r>
-        <w:rPr>
-          <w:rFonts w:ascii="Arial" w:eastAsia="Arial" w:hAnsi="Arial" w:cs="Arial"/>
-          <w:noProof/>
-          <w:sz w:val="24"/>
-          <w:szCs w:val="24"/>
-        </w:rPr>
-        <w:t>{{VALOR_CUOTA_LETRAS}} ({{VALOR_CUOTA_NUMERO}})</w:t>
-      </w:r>
-      <w:r>
-        <w:rPr>
-          <w:rFonts w:ascii="Arial" w:eastAsia="Arial" w:hAnsi="Arial" w:cs="Arial"/>
-          <w:sz w:val="24"/>
-          <w:szCs w:val="24"/>
-          <w:highlight w:val="yellow"/>
-        </w:rPr>
-        <w:t xml:space="preserve"> cada una incluido IVA el valor cada una, el valor antes de IVA: </w:t>
-      </w:r>
-      <w:r>
-        <w:rPr>
-          <w:rFonts w:ascii="Arial" w:eastAsia="Arial" w:hAnsi="Arial" w:cs="Arial"/>
-          <w:sz w:val="24"/>
-          <w:szCs w:val="24"/>
-        </w:rPr>
-        <w:t>{{VALOR_CUOTA_ANTES_IVA_LETRAS}}</w:t>
-      </w:r>
-      <w:r>
-        <w:rPr>
-          <w:rFonts w:ascii="Arial" w:eastAsia="Arial" w:hAnsi="Arial" w:cs="Arial"/>
-          <w:sz w:val="24"/>
-          <w:szCs w:val="24"/>
-          <w:highlight w:val="yellow"/>
-        </w:rPr>
-        <w:t xml:space="preserve"> (</w:t>
-      </w:r>
-      <w:r>
-        <w:rPr>
-          <w:rFonts w:ascii="Arial" w:eastAsia="Arial" w:hAnsi="Arial" w:cs="Arial"/>
-          <w:sz w:val="24"/>
-          <w:szCs w:val="24"/>
-        </w:rPr>
-        <w:t>{{VALOR_CUOTA_ANTES_IVA}}</w:t>
-      </w:r>
-      <w:r>
-        <w:rPr>
-          <w:rFonts w:ascii="Arial" w:eastAsia="Arial" w:hAnsi="Arial" w:cs="Arial"/>
-          <w:sz w:val="24"/>
-          <w:szCs w:val="24"/>
-          <w:highlight w:val="yellow"/>
-        </w:rPr>
-        <w:t xml:space="preserve">) más el valor IVA de </w:t>
-      </w:r>
-      <w:r>
-        <w:rPr>
-          <w:rFonts w:ascii="Arial" w:eastAsia="Arial" w:hAnsi="Arial" w:cs="Arial"/>
-          <w:sz w:val="24"/>
-          <w:szCs w:val="24"/>
-        </w:rPr>
-        <w:t>{{VALOR_CUOTA_IVA_LETRAS}}</w:t>
-      </w:r>
-      <w:r>
-        <w:rPr>
-          <w:rFonts w:ascii="Arial" w:eastAsia="Arial" w:hAnsi="Arial" w:cs="Arial"/>
-          <w:sz w:val="24"/>
-          <w:szCs w:val="24"/>
-          <w:highlight w:val="yellow"/>
-        </w:rPr>
-        <w:t xml:space="preserve"> (</w:t>
+        <w:t>{</w:t>
       </w:r>
       <w:bookmarkStart w:id="0" w:name="_GoBack"/>
       <w:bookmarkEnd w:id="0"/>
+      <w:r>
+        <w:rPr>
+          <w:rFonts w:ascii="Arial" w:eastAsia="Arial" w:hAnsi="Arial" w:cs="Arial"/>
+          <w:sz w:val="24"/>
+          <w:szCs w:val="24"/>
+        </w:rPr>
+        <w:t>{VALOR_IVA}}</w:t>
+      </w:r>
+      <w:r>
+        <w:rPr>
+          <w:rFonts w:ascii="Arial" w:eastAsia="Arial" w:hAnsi="Arial" w:cs="Arial"/>
+          <w:sz w:val="24"/>
+          <w:szCs w:val="24"/>
+          <w:highlight w:val="yellow"/>
+        </w:rPr>
+        <w:t xml:space="preserve">). El Distrito de Santiago de Cali pagará el valor del contrato en </w:t>
+      </w:r>
+      <w:r>
+        <w:rPr>
+          <w:rFonts w:ascii="Arial" w:eastAsia="Arial" w:hAnsi="Arial" w:cs="Arial"/>
+          <w:sz w:val="24"/>
+          <w:szCs w:val="24"/>
+        </w:rPr>
+        <w:t>{{NUM_CUOTAS_LETRAS}}</w:t>
+      </w:r>
+      <w:r>
+        <w:rPr>
+          <w:rFonts w:ascii="Arial" w:eastAsia="Arial" w:hAnsi="Arial" w:cs="Arial"/>
+          <w:sz w:val="24"/>
+          <w:szCs w:val="24"/>
+          <w:highlight w:val="yellow"/>
+        </w:rPr>
+        <w:t xml:space="preserve"> (</w:t>
+      </w:r>
+      <w:r>
+        <w:rPr>
+          <w:rFonts w:ascii="Arial" w:eastAsia="Arial" w:hAnsi="Arial" w:cs="Arial"/>
+          <w:sz w:val="24"/>
+          <w:szCs w:val="24"/>
+        </w:rPr>
+        <w:t>{{NUM_CUOTAS_NUMERO}}</w:t>
+      </w:r>
+      <w:r>
+        <w:rPr>
+          <w:rFonts w:ascii="Arial" w:eastAsia="Arial" w:hAnsi="Arial" w:cs="Arial"/>
+          <w:sz w:val="24"/>
+          <w:szCs w:val="24"/>
+          <w:highlight w:val="yellow"/>
+        </w:rPr>
+        <w:t xml:space="preserve">) Cuotas de </w:t>
+      </w:r>
+      <w:r>
+        <w:rPr>
+          <w:rFonts w:ascii="Arial" w:eastAsia="Arial" w:hAnsi="Arial" w:cs="Arial"/>
+          <w:noProof/>
+          <w:sz w:val="24"/>
+          <w:szCs w:val="24"/>
+        </w:rPr>
+        <w:t>{{VALOR_CUOTA_LETRAS}} ({{VALOR_CUOTA_NUMERO}})</w:t>
+      </w:r>
+      <w:r>
+        <w:rPr>
+          <w:rFonts w:ascii="Arial" w:eastAsia="Arial" w:hAnsi="Arial" w:cs="Arial"/>
+          <w:sz w:val="24"/>
+          <w:szCs w:val="24"/>
+          <w:highlight w:val="yellow"/>
+        </w:rPr>
+        <w:t xml:space="preserve"> cada una incluido IVA el valor cada una, el valor antes de IVA: </w:t>
+      </w:r>
+      <w:r>
+        <w:rPr>
+          <w:rFonts w:ascii="Arial" w:eastAsia="Arial" w:hAnsi="Arial" w:cs="Arial"/>
+          <w:sz w:val="24"/>
+          <w:szCs w:val="24"/>
+        </w:rPr>
+        <w:t>{{VALOR_CUOTA_ANTES_IVA_LETRAS}}</w:t>
+      </w:r>
+      <w:r>
+        <w:rPr>
+          <w:rFonts w:ascii="Arial" w:eastAsia="Arial" w:hAnsi="Arial" w:cs="Arial"/>
+          <w:sz w:val="24"/>
+          <w:szCs w:val="24"/>
+          <w:highlight w:val="yellow"/>
+        </w:rPr>
+        <w:t xml:space="preserve"> (</w:t>
+      </w:r>
+      <w:r>
+        <w:rPr>
+          <w:rFonts w:ascii="Arial" w:eastAsia="Arial" w:hAnsi="Arial" w:cs="Arial"/>
+          <w:sz w:val="24"/>
+          <w:szCs w:val="24"/>
+        </w:rPr>
+        <w:t>{{VALOR_CUOTA_ANTES_IVA}}</w:t>
+      </w:r>
+      <w:r>
+        <w:rPr>
+          <w:rFonts w:ascii="Arial" w:eastAsia="Arial" w:hAnsi="Arial" w:cs="Arial"/>
+          <w:sz w:val="24"/>
+          <w:szCs w:val="24"/>
+          <w:highlight w:val="yellow"/>
+        </w:rPr>
+        <w:t xml:space="preserve">) más el valor IVA de </w:t>
+      </w:r>
+      <w:r>
+        <w:rPr>
+          <w:rFonts w:ascii="Arial" w:eastAsia="Arial" w:hAnsi="Arial" w:cs="Arial"/>
+          <w:sz w:val="24"/>
+          <w:szCs w:val="24"/>
+        </w:rPr>
+        <w:t>{{VALOR_CUOTA_IVA_LETRAS}}</w:t>
+      </w:r>
+      <w:r>
+        <w:rPr>
+          <w:rFonts w:ascii="Arial" w:eastAsia="Arial" w:hAnsi="Arial" w:cs="Arial"/>
+          <w:sz w:val="24"/>
+          <w:szCs w:val="24"/>
+          <w:highlight w:val="yellow"/>
+        </w:rPr>
+        <w:t xml:space="preserve"> (</w:t>
+      </w:r>
       <w:r>
         <w:rPr>
           <w:rFonts w:ascii="Arial" w:eastAsia="Arial" w:hAnsi="Arial" w:cs="Arial"/>
@@ -7804,7 +7812,7 @@
   <a:extraClrSchemeLst/>
   <a:extLst>
     <a:ext uri="{05A4C25C-085E-4340-85A3-A5531E510DB2}">
-      <thm15:themeFamily xmlns="" xmlns:thm15="http://schemas.microsoft.com/office/thememl/2012/main" name="Office Theme" id="{62F939B6-93AF-4DB8-9C6B-D6C7DFDC589F}" vid="{4A3C46E8-61CC-4603-A589-7422A47A8E4A}"/>
+      <thm15:themeFamily xmlns:thm15="http://schemas.microsoft.com/office/thememl/2012/main" xmlns="" name="Office Theme" id="{62F939B6-93AF-4DB8-9C6B-D6C7DFDC589F}" vid="{4A3C46E8-61CC-4603-A589-7422A47A8E4A}"/>
     </a:ext>
   </a:extLst>
 </a:theme>
@@ -7830,7 +7838,7 @@
 </file>
 
 <file path=customXml/itemProps2.xml><?xml version="1.0" encoding="utf-8"?>
-<ds:datastoreItem xmlns:ds="http://schemas.openxmlformats.org/officeDocument/2006/customXml" ds:itemID="{5D44BD01-B992-4F8D-B017-AA27CE5BACDD}">
+<ds:datastoreItem xmlns:ds="http://schemas.openxmlformats.org/officeDocument/2006/customXml" ds:itemID="{FA0EA80C-D614-4F4E-9B94-6927AD6B7BB4}">
   <ds:schemaRefs>
     <ds:schemaRef ds:uri="http://schemas.openxmlformats.org/officeDocument/2006/bibliography"/>
   </ds:schemaRefs>

</xml_diff>